<commit_message>
docs: align manual chapter 11 with disclaimer v1.1
- Chapter retitled to "Disclaimer e note legali"
- Opening paragraph spells out the open-source / personal / MIT framing
- Bullet list updated: 13 points instead of 10, now including the
  AI Act carve-out, localStorage / no proprietary server, art. 21 CPI
  for descriptive trademark use, art. 1229 c.c. reservation, and the
  foro-del-consumatore clause
- Settings reference now points to the renamed
  "9 · Disclaimer e note legali" section
- Settings sub-section in chapter 9 also retitled and bullet text
  updated to describe the 13-article structure
- "PezzaliApp" left in place where it acts as a project brand
  (cover byline, privacy bullet, credits) per project convention
</commit_message>
<xml_diff>
--- a/docs/Manuale-TireCheckTire.docx
+++ b/docs/Manuale-TireCheckTire.docx
@@ -1971,7 +1971,7 @@
           <w:color w:val="0A0A0A"/>
           <w:sz w:val="28"/>
         </w:rPr>
-        <w:t>9 · Termini e responsabilità</w:t>
+        <w:t>9 · Disclaimer e note legali</w:t>
       </w:r>
     </w:p>
     <w:p>
@@ -1979,7 +1979,7 @@
         <w:spacing w:after="160"/>
       </w:pPr>
       <w:r>
-        <w:t>Testo completo del disclaimer legale (12 sezioni: natura del servizio, diagnosi AI come valore indicativo, responsabilità sui dati inseriti, costi di terze parti, servizi esterni, conservazione dati, privacy/GDPR, marchi di terzi, sicurezza informatica, limitazione di responsabilità, modifiche, legge applicabile). Sempre consultabile da qui. Il pulsante 'Riapri schermata accettazione' permette di rileggere il disclaimer con la checkbox originale.</w:t>
+        <w:t>Testo completo del disclaimer open source (13 sezioni: natura del progetto e rilascio MIT, valore indicativo della diagnosi AI, esclusione dall'AI Act ad alto rischio, responsabilità sui dati inseriti, costi di terze parti, servizi esterni, conservazione dati, privacy/GDPR/localStorage, marchi di terzi, sicurezza informatica, limitazione di responsabilità, evoluzione del progetto, legge italiana e foro). Sempre consultabile da qui. Il pulsante 'Riapri schermata di presa visione' permette di rileggere il disclaimer con la checkbox originale.</w:t>
       </w:r>
     </w:p>
     <w:p>
@@ -2168,7 +2168,7 @@
           <w:color w:val="0A0A0A"/>
           <w:sz w:val="40"/>
         </w:rPr>
-        <w:t>11. Disclaimer e responsabilità</w:t>
+        <w:t>11. Disclaimer e note legali</w:t>
       </w:r>
     </w:p>
     <w:p>
@@ -2176,7 +2176,15 @@
         <w:spacing w:after="160"/>
       </w:pPr>
       <w:r>
-        <w:t>All'apertura dell'app — e ogni volta che la versione del documento cambia — compare una schermata bloccante che chiede di accettare i termini d'uso. L'app non funziona finché la casella non è spuntata e il pulsante 'Accetta e continua' premuto.</w:t>
+        <w:t>TireCheckTire è un progetto open source rilasciato gratuitamente a titolo personale da Alessandro Pezzali, persona fisica, al di fuori di qualsiasi attività professionale, commerciale o d'impresa. Il codice è su github.com/pezzaliapp/TireCheckTire sotto licenza MIT. Non sussiste alcun rapporto contrattuale tra l'autore e gli utenti dell'applicazione.</w:t>
+      </w:r>
+    </w:p>
+    <w:p>
+      <w:pPr>
+        <w:spacing w:after="160"/>
+      </w:pPr>
+      <w:r>
+        <w:t>All'apertura dell'app — e ogni volta che la versione del documento cambia — compare una schermata bloccante che chiede di prendere visione del disclaimer. L'app non funziona finché la casella non è spuntata e il pulsante 'Accetta e continua' premuto.</w:t>
       </w:r>
     </w:p>
     <w:p>
@@ -2192,7 +2200,7 @@
         <w:pStyle w:val="ListBullet"/>
       </w:pPr>
       <w:r>
-        <w:t>Natura del servizio: PWA fornita "AS IS", senza garanzie</w:t>
+        <w:t>Natura del progetto: rilascio personale gratuito sotto licenza MIT, fornito "AS IS", senza garanzie</w:t>
       </w:r>
     </w:p>
     <w:p>
@@ -2208,6 +2216,14 @@
         <w:pStyle w:val="ListBullet"/>
       </w:pPr>
       <w:r>
+        <w:t>AI Act (Reg. UE 2024/1689): l'app NON è un sistema AI ad alto rischio e non prende decisioni autonome di sicurezza</w:t>
+      </w:r>
+    </w:p>
+    <w:p>
+      <w:pPr>
+        <w:pStyle w:val="ListBullet"/>
+      </w:pPr>
+      <w:r>
         <w:t>Inserimento dati: responsabilità esclusiva dell'utente</w:t>
       </w:r>
     </w:p>
@@ -2232,7 +2248,7 @@
         <w:pStyle w:val="ListBullet"/>
       </w:pPr>
       <w:r>
-        <w:t>Conservazione dati: backup a carico dell'utente</w:t>
+        <w:t>Conservazione dati: backup a carico dell'utente (solo localStorage, nessun server proprietario)</w:t>
       </w:r>
     </w:p>
     <w:p>
@@ -2240,7 +2256,7 @@
         <w:pStyle w:val="ListBullet"/>
       </w:pPr>
       <w:r>
-        <w:t>Privacy/GDPR: l'utente è Titolare del Trattamento</w:t>
+        <w:t>Privacy/GDPR: nessun cookie di tracciamento; l'utente che tratta dati di terzi è Titolare del Trattamento</w:t>
       </w:r>
     </w:p>
     <w:p>
@@ -2248,7 +2264,7 @@
         <w:pStyle w:val="ListBullet"/>
       </w:pPr>
       <w:r>
-        <w:t>Marchi di terzi: usati a solo titolo descrittivo</w:t>
+        <w:t>Marchi di terzi: uso descrittivo ex art. 21 CPI (D.Lgs. 30/2005)</w:t>
       </w:r>
     </w:p>
     <w:p>
@@ -2264,15 +2280,23 @@
         <w:pStyle w:val="ListBullet"/>
       </w:pPr>
       <w:r>
-        <w:t>Limitazione di responsabilità: come da legge italiana</w:t>
+        <w:t>Limitazione di responsabilità: come da legge italiana, fatta salva responsabilità per dolo o colpa grave ex art. 1229 c.c.</w:t>
       </w:r>
     </w:p>
     <w:p>
       <w:pPr>
+        <w:pStyle w:val="ListBullet"/>
+      </w:pPr>
+      <w:r>
+        <w:t>Foro: luogo di residenza dell'autore, fatto salvo foro del consumatore</w:t>
+      </w:r>
+    </w:p>
+    <w:p>
+      <w:pPr>
         <w:spacing w:after="160"/>
       </w:pPr>
       <w:r>
-        <w:t>Il testo integrale è sempre consultabile da Impostazioni → '9 · Termini e responsabilità'. Una versione sintetica del disclaimer viene stampata anche in fondo a ogni PDF (report di analisi e preventivi) come tutela aggiuntiva.</w:t>
+        <w:t>Il testo integrale è sempre consultabile da Impostazioni → '9 · Disclaimer e note legali'. Una versione sintetica del disclaimer viene stampata anche in fondo a ogni PDF (report di analisi e preventivi) come tutela aggiuntiva.</w:t>
       </w:r>
     </w:p>
     <w:p>

</xml_diff>